<commit_message>
更新 BETT SHOW 家中教學 Word
</commit_message>
<xml_diff>
--- a/bett/教學.docx
+++ b/bett/教學.docx
@@ -79,14 +79,21 @@
         </w:rPr>
         <w:t>學生</w:t>
       </w:r>
-      <w:bookmarkStart w:id="0" w:name="_GoBack"/>
-      <w:bookmarkEnd w:id="0"/>
+      <w:proofErr w:type="spellStart"/>
       <w:r>
         <w:rPr>
           <w:rFonts w:cs="Times New Roman"/>
           <w:color w:val="33691E"/>
         </w:rPr>
-        <w:t xml:space="preserve">指引　｜　</w:t>
+        <w:t>指引</w:t>
+      </w:r>
+      <w:proofErr w:type="spellEnd"/>
+      <w:r>
+        <w:rPr>
+          <w:rFonts w:cs="Times New Roman"/>
+          <w:color w:val="33691E"/>
+        </w:rPr>
+        <w:t xml:space="preserve">　｜　</w:t>
       </w:r>
       <w:proofErr w:type="spellStart"/>
       <w:r>
@@ -171,20 +178,12 @@
         </w:rPr>
         <w:t>micro:bit</w:t>
       </w:r>
-      <w:proofErr w:type="spellEnd"/>
       <w:proofErr w:type="gramEnd"/>
       <w:r>
         <w:rPr>
           <w:rFonts w:cs="Times New Roman"/>
         </w:rPr>
-        <w:t>，</w:t>
-      </w:r>
-      <w:proofErr w:type="spellStart"/>
-      <w:r>
-        <w:rPr>
-          <w:rFonts w:cs="Times New Roman"/>
-        </w:rPr>
-        <w:t>供學生帶回家進行活動。</w:t>
+        <w:t>，供學生帶回家進行活動。</w:t>
       </w:r>
       <w:r>
         <w:rPr>
@@ -251,13 +250,7 @@
         <w:rPr>
           <w:rFonts w:cs="Times New Roman"/>
         </w:rPr>
-        <w:t>本活動的目標，是製作一條模擬路線：</w:t>
-      </w:r>
-      <w:r>
-        <w:rPr>
-          <w:rFonts w:cs="Times New Roman"/>
-        </w:rPr>
-        <w:t>砌出「佛教志蓮小學」，再用黑色膠紙連接課室、走廊及收集點，讓小車沿線行駛，情況一如短片所示。</w:t>
+        <w:t>本活動的目標，是製作一條模擬路線：砌出「佛教志蓮小學」，再用黑色膠紙連接課室、走廊及收集點，讓小車沿線行駛，情況一如短片所示。</w:t>
       </w:r>
     </w:p>
     <w:p>
@@ -654,16 +647,7 @@
                 <w:color w:val="1B5E20"/>
                 <w:sz w:val="22"/>
               </w:rPr>
-              <w:t xml:space="preserve"> </w:t>
-            </w:r>
-            <w:r>
-              <w:rPr>
-                <w:rFonts w:cs="Times New Roman"/>
-                <w:b/>
-                <w:color w:val="1B5E20"/>
-                <w:sz w:val="22"/>
-              </w:rPr>
-              <w:t>BETT SHOW</w:t>
+              <w:t xml:space="preserve"> BETT SHOW</w:t>
             </w:r>
           </w:p>
         </w:tc>
@@ -792,7 +776,6 @@
       <w:pPr>
         <w:spacing w:before="20" w:after="20"/>
         <w:rPr>
-          <w:rFonts w:hint="eastAsia"/>
           <w:lang w:eastAsia="zh-TW"/>
         </w:rPr>
       </w:pPr>
@@ -891,6 +874,7 @@
           <w:color w:val="1B5E20"/>
           <w:sz w:val="28"/>
         </w:rPr>
+        <w:lastRenderedPageBreak/>
         <w:t>四、活動重點：製作模擬校園</w:t>
       </w:r>
       <w:proofErr w:type="spellEnd"/>
@@ -908,7 +892,6 @@
         <w:rPr>
           <w:rFonts w:cs="Times New Roman"/>
         </w:rPr>
-        <w:lastRenderedPageBreak/>
         <w:t>請先對照上述兩段短片，再參考本校校舍外觀，用紙皮製作小型「佛教志蓮小學</w:t>
       </w:r>
       <w:proofErr w:type="spellEnd"/>
@@ -1415,13 +1398,7 @@
         <w:rPr>
           <w:rFonts w:cs="Times New Roman"/>
         </w:rPr>
-        <w:t xml:space="preserve"> </w:t>
-      </w:r>
-      <w:r>
-        <w:rPr>
-          <w:rFonts w:cs="Times New Roman"/>
-        </w:rPr>
-        <w:t xml:space="preserve">A </w:t>
+        <w:t xml:space="preserve"> A </w:t>
       </w:r>
       <w:proofErr w:type="spellStart"/>
       <w:r>
@@ -1435,13 +1412,7 @@
         <w:rPr>
           <w:rFonts w:cs="Times New Roman"/>
         </w:rPr>
-        <w:t xml:space="preserve"> </w:t>
-      </w:r>
-      <w:r>
-        <w:rPr>
-          <w:rFonts w:cs="Times New Roman"/>
-        </w:rPr>
-        <w:t xml:space="preserve">B </w:t>
+        <w:t xml:space="preserve"> B </w:t>
       </w:r>
       <w:proofErr w:type="spellStart"/>
       <w:r>
@@ -1537,8 +1508,9 @@
           <w:color w:val="1B5E20"/>
           <w:sz w:val="28"/>
         </w:rPr>
-        <w:t xml:space="preserve"> </w:t>
-      </w:r>
+        <w:t xml:space="preserve"> do </w:t>
+      </w:r>
+      <w:proofErr w:type="gramStart"/>
       <w:r>
         <w:rPr>
           <w:rFonts w:cs="Times New Roman"/>
@@ -1546,9 +1518,9 @@
           <w:color w:val="1B5E20"/>
           <w:sz w:val="28"/>
         </w:rPr>
-        <w:t xml:space="preserve">do </w:t>
-      </w:r>
-      <w:proofErr w:type="gramStart"/>
+        <w:t>your :bit</w:t>
+      </w:r>
+      <w:proofErr w:type="gramEnd"/>
       <w:r>
         <w:rPr>
           <w:rFonts w:cs="Times New Roman"/>
@@ -1556,9 +1528,9 @@
           <w:color w:val="1B5E20"/>
           <w:sz w:val="28"/>
         </w:rPr>
-        <w:t>your :bit</w:t>
-      </w:r>
-      <w:proofErr w:type="gramEnd"/>
+        <w:t xml:space="preserve"> </w:t>
+      </w:r>
+      <w:proofErr w:type="spellStart"/>
       <w:r>
         <w:rPr>
           <w:rFonts w:cs="Times New Roman"/>
@@ -1566,9 +1538,9 @@
           <w:color w:val="1B5E20"/>
           <w:sz w:val="28"/>
         </w:rPr>
-        <w:t xml:space="preserve"> </w:t>
-      </w:r>
-      <w:proofErr w:type="spellStart"/>
+        <w:t>挑戰賽</w:t>
+      </w:r>
+      <w:proofErr w:type="spellEnd"/>
       <w:r>
         <w:rPr>
           <w:rFonts w:cs="Times New Roman"/>
@@ -1576,26 +1548,7 @@
           <w:color w:val="1B5E20"/>
           <w:sz w:val="28"/>
         </w:rPr>
-        <w:t>挑戰賽</w:t>
-      </w:r>
-      <w:proofErr w:type="spellEnd"/>
-      <w:r>
-        <w:rPr>
-          <w:rFonts w:cs="Times New Roman"/>
-          <w:b/>
-          <w:color w:val="1B5E20"/>
-          <w:sz w:val="28"/>
-        </w:rPr>
-        <w:t xml:space="preserve"> </w:t>
-      </w:r>
-      <w:r>
-        <w:rPr>
-          <w:rFonts w:cs="Times New Roman"/>
-          <w:b/>
-          <w:color w:val="1B5E20"/>
-          <w:sz w:val="28"/>
-        </w:rPr>
-        <w:t>2026</w:t>
+        <w:t xml:space="preserve"> 2026</w:t>
       </w:r>
     </w:p>
     <w:p>
@@ -1715,6 +1668,9 @@
     <w:p>
       <w:pPr>
         <w:spacing w:before="20" w:after="80"/>
+        <w:rPr>
+          <w:rFonts w:cs="Times New Roman"/>
+        </w:rPr>
       </w:pPr>
       <w:proofErr w:type="gramStart"/>
       <w:r>
@@ -1804,6 +1760,240 @@
     </w:p>
     <w:p>
       <w:pPr>
+        <w:spacing w:before="20" w:after="80"/>
+        <w:rPr>
+          <w:rFonts w:cs="Times New Roman"/>
+          <w:b/>
+          <w:sz w:val="28"/>
+        </w:rPr>
+      </w:pPr>
+      <w:proofErr w:type="gramStart"/>
+      <w:r>
+        <w:rPr>
+          <w:rFonts w:cs="Times New Roman"/>
+        </w:rPr>
+        <w:t>•</w:t>
+      </w:r>
+      <w:proofErr w:type="gramEnd"/>
+      <w:r>
+        <w:rPr>
+          <w:rFonts w:cs="Times New Roman"/>
+        </w:rPr>
+        <w:t xml:space="preserve">  </w:t>
+      </w:r>
+      <w:r>
+        <w:rPr>
+          <w:rFonts w:cs="Times New Roman" w:hint="eastAsia"/>
+          <w:b/>
+          <w:sz w:val="28"/>
+          <w:lang w:eastAsia="zh-TW"/>
+        </w:rPr>
+        <w:t>校外</w:t>
+      </w:r>
+      <w:proofErr w:type="spellStart"/>
+      <w:r>
+        <w:rPr>
+          <w:rFonts w:cs="Times New Roman"/>
+          <w:b/>
+          <w:sz w:val="28"/>
+        </w:rPr>
+        <w:t>比賽</w:t>
+      </w:r>
+      <w:proofErr w:type="spellEnd"/>
+      <w:r>
+        <w:rPr>
+          <w:rFonts w:cs="Times New Roman" w:hint="eastAsia"/>
+          <w:b/>
+          <w:sz w:val="28"/>
+          <w:lang w:eastAsia="zh-TW"/>
+        </w:rPr>
+        <w:t>地點</w:t>
+      </w:r>
+      <w:r>
+        <w:rPr>
+          <w:rFonts w:cs="Times New Roman"/>
+          <w:b/>
+          <w:sz w:val="28"/>
+        </w:rPr>
+        <w:t>：</w:t>
+      </w:r>
+      <w:r>
+        <w:rPr>
+          <w:rFonts w:cs="Times New Roman" w:hint="eastAsia"/>
+          <w:b/>
+          <w:sz w:val="28"/>
+        </w:rPr>
+        <w:t>聖公會何明華會督中學</w:t>
+      </w:r>
+      <w:r>
+        <w:rPr>
+          <w:rFonts w:cs="Times New Roman" w:hint="eastAsia"/>
+          <w:b/>
+          <w:sz w:val="28"/>
+        </w:rPr>
+        <w:t xml:space="preserve"> (</w:t>
+      </w:r>
+      <w:proofErr w:type="spellStart"/>
+      <w:r>
+        <w:rPr>
+          <w:rFonts w:cs="Times New Roman" w:hint="eastAsia"/>
+          <w:b/>
+          <w:sz w:val="28"/>
+        </w:rPr>
+        <w:t>地址</w:t>
+      </w:r>
+      <w:proofErr w:type="spellEnd"/>
+      <w:r>
+        <w:rPr>
+          <w:rFonts w:cs="Times New Roman" w:hint="eastAsia"/>
+          <w:b/>
+          <w:sz w:val="28"/>
+        </w:rPr>
+        <w:t>：</w:t>
+      </w:r>
+      <w:r>
+        <w:rPr>
+          <w:rFonts w:cs="Times New Roman" w:hint="eastAsia"/>
+          <w:b/>
+          <w:sz w:val="28"/>
+        </w:rPr>
+        <w:t xml:space="preserve"> </w:t>
+      </w:r>
+      <w:r>
+        <w:rPr>
+          <w:rFonts w:cs="Times New Roman" w:hint="eastAsia"/>
+          <w:b/>
+          <w:sz w:val="28"/>
+        </w:rPr>
+        <w:t>九龍秀茂坪曉光街</w:t>
+      </w:r>
+      <w:r>
+        <w:rPr>
+          <w:rFonts w:cs="Times New Roman" w:hint="eastAsia"/>
+          <w:b/>
+          <w:sz w:val="28"/>
+        </w:rPr>
+        <w:t>82</w:t>
+      </w:r>
+      <w:r>
+        <w:rPr>
+          <w:rFonts w:cs="Times New Roman" w:hint="eastAsia"/>
+          <w:b/>
+          <w:sz w:val="28"/>
+        </w:rPr>
+        <w:t>號</w:t>
+      </w:r>
+      <w:r>
+        <w:rPr>
+          <w:rFonts w:cs="Times New Roman" w:hint="eastAsia"/>
+          <w:b/>
+          <w:sz w:val="28"/>
+        </w:rPr>
+        <w:t>)</w:t>
+      </w:r>
+    </w:p>
+    <w:p>
+      <w:pPr>
+        <w:spacing w:before="20" w:after="80"/>
+      </w:pPr>
+      <w:r>
+        <w:rPr>
+          <w:rFonts w:cs="Times New Roman"/>
+        </w:rPr>
+        <w:t xml:space="preserve">•  </w:t>
+      </w:r>
+      <w:r>
+        <w:rPr>
+          <w:rFonts w:cs="Times New Roman" w:hint="eastAsia"/>
+          <w:b/>
+          <w:sz w:val="28"/>
+          <w:lang w:eastAsia="zh-TW"/>
+        </w:rPr>
+        <w:t>校</w:t>
+      </w:r>
+      <w:bookmarkStart w:id="0" w:name="_GoBack"/>
+      <w:bookmarkEnd w:id="0"/>
+      <w:r>
+        <w:rPr>
+          <w:rFonts w:cs="Times New Roman" w:hint="eastAsia"/>
+          <w:b/>
+          <w:sz w:val="28"/>
+          <w:lang w:eastAsia="zh-TW"/>
+        </w:rPr>
+        <w:t>外</w:t>
+      </w:r>
+      <w:proofErr w:type="spellStart"/>
+      <w:r>
+        <w:rPr>
+          <w:rFonts w:cs="Times New Roman"/>
+          <w:b/>
+          <w:sz w:val="28"/>
+        </w:rPr>
+        <w:t>比賽</w:t>
+      </w:r>
+      <w:proofErr w:type="spellEnd"/>
+      <w:r>
+        <w:rPr>
+          <w:rFonts w:cs="Times New Roman" w:hint="eastAsia"/>
+          <w:b/>
+          <w:sz w:val="28"/>
+          <w:lang w:eastAsia="zh-TW"/>
+        </w:rPr>
+        <w:t>時間</w:t>
+      </w:r>
+      <w:r>
+        <w:rPr>
+          <w:rFonts w:cs="Times New Roman"/>
+          <w:b/>
+          <w:sz w:val="28"/>
+        </w:rPr>
+        <w:t>：</w:t>
+      </w:r>
+      <w:r>
+        <w:rPr>
+          <w:rFonts w:cs="Times New Roman" w:hint="eastAsia"/>
+          <w:b/>
+          <w:sz w:val="28"/>
+          <w:lang w:eastAsia="zh-TW"/>
+        </w:rPr>
+        <w:t>上午</w:t>
+      </w:r>
+      <w:r>
+        <w:rPr>
+          <w:rFonts w:cs="Times New Roman" w:hint="eastAsia"/>
+          <w:b/>
+          <w:sz w:val="28"/>
+          <w:lang w:eastAsia="zh-TW"/>
+        </w:rPr>
+        <w:t>(</w:t>
+      </w:r>
+      <w:r>
+        <w:rPr>
+          <w:rFonts w:cs="Times New Roman" w:hint="eastAsia"/>
+          <w:b/>
+          <w:sz w:val="28"/>
+          <w:lang w:eastAsia="zh-TW"/>
+        </w:rPr>
+        <w:t>待定</w:t>
+      </w:r>
+      <w:r>
+        <w:rPr>
+          <w:rFonts w:cs="Times New Roman" w:hint="eastAsia"/>
+          <w:b/>
+          <w:sz w:val="28"/>
+          <w:lang w:eastAsia="zh-TW"/>
+        </w:rPr>
+        <w:t>)</w:t>
+      </w:r>
+      <w:r>
+        <w:rPr>
+          <w:rFonts w:cs="Times New Roman"/>
+        </w:rPr>
+        <w:t>。</w:t>
+      </w:r>
+    </w:p>
+    <w:p>
+      <w:pPr>
         <w:spacing w:before="40" w:after="40"/>
       </w:pPr>
       <w:r>
@@ -1848,15 +2038,7 @@
           <w:b/>
           <w:color w:val="1B5E20"/>
         </w:rPr>
-        <w:t xml:space="preserve"> </w:t>
-      </w:r>
-      <w:r>
-        <w:rPr>
-          <w:rFonts w:cs="Times New Roman"/>
-          <w:b/>
-          <w:color w:val="1B5E20"/>
-        </w:rPr>
-        <w:t>2026</w:t>
+        <w:t xml:space="preserve"> 2026</w:t>
       </w:r>
     </w:p>
     <w:p>
@@ -1875,13 +2057,7 @@
         <w:rPr>
           <w:rFonts w:cs="Times New Roman"/>
         </w:rPr>
-        <w:t xml:space="preserve"> </w:t>
-      </w:r>
-      <w:r>
-        <w:rPr>
-          <w:rFonts w:cs="Times New Roman"/>
-        </w:rPr>
-        <w:t xml:space="preserve">8 </w:t>
+        <w:t xml:space="preserve"> 8 </w:t>
       </w:r>
       <w:r>
         <w:rPr>
@@ -1893,13 +2069,7 @@
         <w:rPr>
           <w:rFonts w:cs="Times New Roman"/>
         </w:rPr>
-        <w:t xml:space="preserve"> </w:t>
-      </w:r>
-      <w:r>
-        <w:rPr>
-          <w:rFonts w:cs="Times New Roman"/>
-        </w:rPr>
-        <w:t xml:space="preserve">18 </w:t>
+        <w:t xml:space="preserve"> 18 </w:t>
       </w:r>
       <w:proofErr w:type="spellStart"/>
       <w:r>
@@ -2093,13 +2263,7 @@
         <w:rPr>
           <w:rFonts w:cs="Times New Roman"/>
         </w:rPr>
-        <w:t xml:space="preserve"> </w:t>
-      </w:r>
-      <w:r>
-        <w:rPr>
-          <w:rFonts w:cs="Times New Roman"/>
-        </w:rPr>
-        <w:t xml:space="preserve">3 </w:t>
+        <w:t xml:space="preserve"> 3 </w:t>
       </w:r>
       <w:proofErr w:type="spellStart"/>
       <w:r>
@@ -14397,7 +14561,7 @@
 </file>
 
 <file path=customXml/itemProps1.xml><?xml version="1.0" encoding="utf-8"?>
-<ds:datastoreItem xmlns:ds="http://schemas.openxmlformats.org/officeDocument/2006/customXml" ds:itemID="{84A13BB4-9500-4655-8B3D-428D54D21513}">
+<ds:datastoreItem xmlns:ds="http://schemas.openxmlformats.org/officeDocument/2006/customXml" ds:itemID="{EB119F86-4423-4806-8ED5-FAB0E6F0B674}">
   <ds:schemaRefs>
     <ds:schemaRef ds:uri="http://schemas.openxmlformats.org/officeDocument/2006/bibliography"/>
   </ds:schemaRefs>

</xml_diff>